<commit_message>
Removed the bdd files
</commit_message>
<xml_diff>
--- a/UI Automation Test Report.docx
+++ b/UI Automation Test Report.docx
@@ -121,17 +121,8 @@
           <w:bCs/>
         </w:rPr>
         <w:br/>
-        <w:t>GitHub Repository (Test Code</w:t>
-      </w:r>
-      <w:proofErr w:type="gramStart"/>
-      <w:r>
-        <w:rPr>
-          <w:b/>
-          <w:bCs/>
-        </w:rPr>
-        <w:t>) :</w:t>
-      </w:r>
-      <w:proofErr w:type="gramEnd"/>
+        <w:t>GitHub Repository (Test Code) :</w:t>
+      </w:r>
       <w:r>
         <w:t xml:space="preserve"> </w:t>
       </w:r>
@@ -282,32 +273,26 @@
         <w:t xml:space="preserve">The user should be able to enter valid source and destination cities and select them from suggested </w:t>
       </w:r>
       <w:proofErr w:type="spellStart"/>
-      <w:proofErr w:type="gramStart"/>
       <w:r>
         <w:t>options.The</w:t>
       </w:r>
       <w:proofErr w:type="spellEnd"/>
-      <w:proofErr w:type="gramEnd"/>
       <w:r>
         <w:t xml:space="preserve"> user should be able to select a future journey </w:t>
       </w:r>
       <w:proofErr w:type="spellStart"/>
-      <w:proofErr w:type="gramStart"/>
       <w:r>
         <w:t>date.On</w:t>
       </w:r>
       <w:proofErr w:type="spellEnd"/>
-      <w:proofErr w:type="gramEnd"/>
       <w:r>
         <w:t xml:space="preserve"> initiating search, the system should display a list of available </w:t>
       </w:r>
       <w:proofErr w:type="spellStart"/>
-      <w:proofErr w:type="gramStart"/>
       <w:r>
         <w:t>buses.Each</w:t>
       </w:r>
       <w:proofErr w:type="spellEnd"/>
-      <w:proofErr w:type="gramEnd"/>
       <w:r>
         <w:t xml:space="preserve"> result should display:</w:t>
       </w:r>
@@ -555,15 +540,7 @@
         </w:numPr>
       </w:pPr>
       <w:r>
-        <w:t xml:space="preserve">I check whether the seat details </w:t>
-      </w:r>
-      <w:proofErr w:type="gramStart"/>
-      <w:r>
-        <w:t>is</w:t>
-      </w:r>
-      <w:proofErr w:type="gramEnd"/>
-      <w:r>
-        <w:t xml:space="preserve"> there</w:t>
+        <w:t>I check whether the seat details is there</w:t>
       </w:r>
     </w:p>
     <w:p>
@@ -1078,17 +1055,20 @@
     </w:p>
     <w:p>
       <w:r>
-        <w:t xml:space="preserve">        │   └───com</w:t>
-      </w:r>
-    </w:p>
-    <w:p>
-      <w:r>
-        <w:t xml:space="preserve">        │       └───selenium</w:t>
-      </w:r>
-    </w:p>
-    <w:p>
-      <w:r>
-        <w:t xml:space="preserve">        │           </w:t>
+        <w:t xml:space="preserve">           └───com</w:t>
+      </w:r>
+    </w:p>
+    <w:p>
+      <w:r>
+        <w:t xml:space="preserve">               └───seleniu</w:t>
+      </w:r>
+      <w:r>
+        <w:t>m</w:t>
+      </w:r>
+    </w:p>
+    <w:p>
+      <w:r>
+        <w:t xml:space="preserve">                   </w:t>
       </w:r>
       <w:r>
         <w:rPr>
@@ -1102,127 +1082,163 @@
         </w:rPr>
         <w:t>───</w:t>
       </w:r>
+      <w:r>
+        <w:t>page</w:t>
+      </w:r>
+    </w:p>
+    <w:p>
+      <w:r>
+        <w:t xml:space="preserve">                   </w:t>
+      </w:r>
+      <w:r>
+        <w:rPr>
+          <w:rFonts w:ascii="MS Gothic" w:eastAsia="MS Gothic" w:hAnsi="MS Gothic" w:cs="MS Gothic" w:hint="eastAsia"/>
+        </w:rPr>
+        <w:t>├</w:t>
+      </w:r>
+      <w:r>
+        <w:rPr>
+          <w:rFonts w:ascii="Aptos" w:hAnsi="Aptos" w:cs="Aptos"/>
+        </w:rPr>
+        <w:t>───</w:t>
+      </w:r>
+      <w:r>
+        <w:t>support</w:t>
+      </w:r>
+    </w:p>
+    <w:p>
+      <w:r>
+        <w:t xml:space="preserve">                   └───Test</w:t>
+      </w:r>
+    </w:p>
+    <w:p>
+      <w:r>
+        <w:t xml:space="preserve">        </w:t>
+      </w:r>
+    </w:p>
+    <w:p>
+      <w:pPr>
+        <w:rPr>
+          <w:b/>
+          <w:bCs/>
+        </w:rPr>
+      </w:pPr>
+      <w:r>
+        <w:rPr>
+          <w:b/>
+          <w:bCs/>
+        </w:rPr>
+        <w:t>Directories and files in the framework</w:t>
+      </w:r>
+    </w:p>
+    <w:p>
+      <w:pPr>
+        <w:rPr>
+          <w:b/>
+          <w:bCs/>
+        </w:rPr>
+      </w:pPr>
+      <w:r>
+        <w:rPr>
+          <w:b/>
+          <w:bCs/>
+        </w:rPr>
+        <w:t>Test</w:t>
+      </w:r>
+      <w:r>
+        <w:rPr>
+          <w:b/>
+          <w:bCs/>
+        </w:rPr>
+        <w:t xml:space="preserve"> Directory</w:t>
+      </w:r>
+    </w:p>
+    <w:p>
+      <w:r>
+        <w:t>Contains test files only.</w:t>
+      </w:r>
+    </w:p>
+    <w:p>
+      <w:r>
+        <w:t xml:space="preserve">File: </w:t>
+      </w:r>
+      <w:r>
+        <w:t>Tested</w:t>
+      </w:r>
+      <w:r>
+        <w:t>.java</w:t>
+      </w:r>
+    </w:p>
+    <w:p>
+      <w:pPr>
+        <w:rPr>
+          <w:b/>
+          <w:bCs/>
+        </w:rPr>
+      </w:pPr>
+      <w:r>
+        <w:rPr>
+          <w:b/>
+          <w:bCs/>
+        </w:rPr>
+        <w:t>Page</w:t>
+      </w:r>
+    </w:p>
+    <w:p>
       <w:proofErr w:type="spellStart"/>
       <w:r>
-        <w:t>bdd</w:t>
+        <w:t>Conatain</w:t>
       </w:r>
       <w:proofErr w:type="spellEnd"/>
-    </w:p>
-    <w:p>
-      <w:r>
-        <w:t xml:space="preserve">        │           </w:t>
-      </w:r>
-      <w:r>
-        <w:rPr>
-          <w:rFonts w:ascii="MS Gothic" w:eastAsia="MS Gothic" w:hAnsi="MS Gothic" w:cs="MS Gothic" w:hint="eastAsia"/>
-        </w:rPr>
-        <w:t>├</w:t>
-      </w:r>
-      <w:r>
-        <w:rPr>
-          <w:rFonts w:ascii="Aptos" w:hAnsi="Aptos" w:cs="Aptos"/>
-        </w:rPr>
-        <w:t>───</w:t>
-      </w:r>
-      <w:r>
-        <w:t>page</w:t>
-      </w:r>
-    </w:p>
-    <w:p>
-      <w:r>
-        <w:t xml:space="preserve">        │           </w:t>
-      </w:r>
-      <w:r>
-        <w:rPr>
-          <w:rFonts w:ascii="MS Gothic" w:eastAsia="MS Gothic" w:hAnsi="MS Gothic" w:cs="MS Gothic" w:hint="eastAsia"/>
-        </w:rPr>
-        <w:t>├</w:t>
-      </w:r>
-      <w:r>
-        <w:rPr>
-          <w:rFonts w:ascii="Aptos" w:hAnsi="Aptos" w:cs="Aptos"/>
-        </w:rPr>
-        <w:t>───</w:t>
-      </w:r>
-      <w:r>
-        <w:t>support</w:t>
-      </w:r>
-    </w:p>
-    <w:p>
-      <w:r>
-        <w:t xml:space="preserve">        │           └───Test</w:t>
-      </w:r>
-    </w:p>
-    <w:p>
-      <w:r>
-        <w:t xml:space="preserve">        └───resources</w:t>
-      </w:r>
-    </w:p>
-    <w:p>
-      <w:r>
-        <w:t xml:space="preserve">            </w:t>
-      </w:r>
-      <w:r>
-        <w:rPr>
-          <w:rFonts w:ascii="MS Gothic" w:eastAsia="MS Gothic" w:hAnsi="MS Gothic" w:cs="MS Gothic" w:hint="eastAsia"/>
-        </w:rPr>
-        <w:t>├</w:t>
-      </w:r>
-      <w:r>
-        <w:rPr>
-          <w:rFonts w:ascii="Aptos" w:hAnsi="Aptos" w:cs="Aptos"/>
-        </w:rPr>
-        <w:t>───</w:t>
-      </w:r>
-      <w:r>
-        <w:t>allure</w:t>
-      </w:r>
-    </w:p>
-    <w:p>
-      <w:r>
-        <w:t xml:space="preserve">            └───features</w:t>
-      </w:r>
-    </w:p>
-    <w:p>
-      <w:pPr>
-        <w:rPr>
-          <w:b/>
-          <w:bCs/>
-        </w:rPr>
-      </w:pPr>
-      <w:r>
-        <w:rPr>
-          <w:b/>
-          <w:bCs/>
-        </w:rPr>
-        <w:t>Directories and files in the framework</w:t>
-      </w:r>
-    </w:p>
-    <w:p>
-      <w:pPr>
-        <w:rPr>
-          <w:b/>
-          <w:bCs/>
-        </w:rPr>
-      </w:pPr>
-      <w:r>
-        <w:rPr>
-          <w:b/>
-          <w:bCs/>
-        </w:rPr>
-        <w:t>Test</w:t>
-      </w:r>
-      <w:r>
-        <w:rPr>
-          <w:b/>
-          <w:bCs/>
-        </w:rPr>
-        <w:t xml:space="preserve"> Directory</w:t>
-      </w:r>
-    </w:p>
-    <w:p>
-      <w:r>
-        <w:t>Contains test files only.</w:t>
+      <w:r>
+        <w:t xml:space="preserve"> different java classes which represent the each page in the </w:t>
+      </w:r>
+      <w:proofErr w:type="spellStart"/>
+      <w:r>
+        <w:t>ui</w:t>
+      </w:r>
+      <w:proofErr w:type="spellEnd"/>
+      <w:r>
+        <w:t>. Here we have added the Base page and extended with all other pages</w:t>
+      </w:r>
+    </w:p>
+    <w:p>
+      <w:r>
+        <w:t xml:space="preserve">Files: </w:t>
+      </w:r>
+      <w:r>
+        <w:t>HomePage.java,ResultPage.Java,BasePage.java</w:t>
+      </w:r>
+    </w:p>
+    <w:p>
+      <w:pPr>
+        <w:rPr>
+          <w:b/>
+          <w:bCs/>
+        </w:rPr>
+      </w:pPr>
+      <w:r>
+        <w:rPr>
+          <w:b/>
+          <w:bCs/>
+        </w:rPr>
+        <w:t>Supports</w:t>
+      </w:r>
+    </w:p>
+    <w:p>
+      <w:r>
+        <w:t xml:space="preserve">Contains </w:t>
+      </w:r>
+      <w:r>
+        <w:t xml:space="preserve">Java classes which supports the whole project . Supports contain utility classes for reusable methods and environment data handling, </w:t>
+      </w:r>
+      <w:proofErr w:type="spellStart"/>
+      <w:r>
+        <w:t>Drivery</w:t>
+      </w:r>
+      <w:proofErr w:type="spellEnd"/>
+      <w:r>
+        <w:t xml:space="preserve"> Factory which is used to select the selenium driver</w:t>
       </w:r>
     </w:p>
     <w:p>
@@ -1230,128 +1246,22 @@
         <w:t xml:space="preserve">File: </w:t>
       </w:r>
       <w:r>
-        <w:t>Tested</w:t>
-      </w:r>
-      <w:r>
-        <w:t>.java</w:t>
-      </w:r>
-    </w:p>
-    <w:p>
-      <w:pPr>
-        <w:rPr>
-          <w:b/>
-          <w:bCs/>
-        </w:rPr>
-      </w:pPr>
-      <w:r>
-        <w:rPr>
-          <w:b/>
-          <w:bCs/>
-        </w:rPr>
-        <w:t>Page</w:t>
-      </w:r>
-    </w:p>
-    <w:p>
-      <w:proofErr w:type="spellStart"/>
-      <w:r>
-        <w:t>Conatain</w:t>
-      </w:r>
-      <w:proofErr w:type="spellEnd"/>
-      <w:r>
-        <w:t xml:space="preserve"> different java classes which represent </w:t>
-      </w:r>
-      <w:proofErr w:type="gramStart"/>
-      <w:r>
-        <w:t>the each</w:t>
-      </w:r>
-      <w:proofErr w:type="gramEnd"/>
-      <w:r>
-        <w:t xml:space="preserve"> page in the </w:t>
-      </w:r>
-      <w:proofErr w:type="spellStart"/>
-      <w:r>
-        <w:t>ui</w:t>
-      </w:r>
-      <w:proofErr w:type="spellEnd"/>
-      <w:r>
-        <w:t>. Here we have added the Base page and extended with all other pages</w:t>
-      </w:r>
-    </w:p>
-    <w:p>
-      <w:r>
-        <w:t xml:space="preserve">Files: </w:t>
-      </w:r>
-      <w:proofErr w:type="gramStart"/>
-      <w:r>
-        <w:t>HomePage.java,ResultPage.Java</w:t>
-      </w:r>
-      <w:proofErr w:type="gramEnd"/>
-      <w:r>
-        <w:t>,BasePage.java</w:t>
-      </w:r>
-    </w:p>
-    <w:p>
-      <w:pPr>
-        <w:rPr>
-          <w:b/>
-          <w:bCs/>
-        </w:rPr>
-      </w:pPr>
-      <w:r>
-        <w:rPr>
-          <w:b/>
-          <w:bCs/>
-        </w:rPr>
-        <w:t>Supports</w:t>
-      </w:r>
-    </w:p>
-    <w:p>
-      <w:r>
+        <w:t>DriverFactory.java,Config.java</w:t>
+      </w:r>
+    </w:p>
+    <w:p>
+      <w:pPr>
+        <w:rPr>
+          <w:b/>
+          <w:bCs/>
+        </w:rPr>
+      </w:pPr>
+      <w:r>
+        <w:rPr>
+          <w:b/>
+          <w:bCs/>
+        </w:rPr>
         <w:lastRenderedPageBreak/>
-        <w:t xml:space="preserve">Contains </w:t>
-      </w:r>
-      <w:r>
-        <w:t xml:space="preserve">Java classes which supports the whole </w:t>
-      </w:r>
-      <w:proofErr w:type="gramStart"/>
-      <w:r>
-        <w:t>project .</w:t>
-      </w:r>
-      <w:proofErr w:type="gramEnd"/>
-      <w:r>
-        <w:t xml:space="preserve"> Supports contain utility classes for reusable methods and environment data handling, </w:t>
-      </w:r>
-      <w:proofErr w:type="spellStart"/>
-      <w:r>
-        <w:t>Drivery</w:t>
-      </w:r>
-      <w:proofErr w:type="spellEnd"/>
-      <w:r>
-        <w:t xml:space="preserve"> Factory which is used to select the selenium driver</w:t>
-      </w:r>
-    </w:p>
-    <w:p>
-      <w:r>
-        <w:t xml:space="preserve">File: </w:t>
-      </w:r>
-      <w:proofErr w:type="gramStart"/>
-      <w:r>
-        <w:t>DriverFactory.java,Config.java</w:t>
-      </w:r>
-      <w:proofErr w:type="gramEnd"/>
-    </w:p>
-    <w:p>
-      <w:pPr>
-        <w:rPr>
-          <w:b/>
-          <w:bCs/>
-        </w:rPr>
-      </w:pPr>
-      <w:r>
-        <w:rPr>
-          <w:b/>
-          <w:bCs/>
-        </w:rPr>
         <w:t>Resources</w:t>
       </w:r>
     </w:p>
@@ -1371,29 +1281,6 @@
           <w:bCs/>
         </w:rPr>
       </w:pPr>
-      <w:proofErr w:type="spellStart"/>
-      <w:r>
-        <w:rPr>
-          <w:b/>
-          <w:bCs/>
-        </w:rPr>
-        <w:t>Bdd</w:t>
-      </w:r>
-      <w:proofErr w:type="spellEnd"/>
-    </w:p>
-    <w:p>
-      <w:r>
-        <w:t>Contains file which supports for cucumber</w:t>
-      </w:r>
-    </w:p>
-    <w:p/>
-    <w:p>
-      <w:pPr>
-        <w:rPr>
-          <w:b/>
-          <w:bCs/>
-        </w:rPr>
-      </w:pPr>
       <w:r>
         <w:rPr>
           <w:b/>
@@ -1411,15 +1298,10 @@
     </w:p>
     <w:p>
       <w:r>
-        <w:t xml:space="preserve">The cucumber and normal test </w:t>
-      </w:r>
-      <w:proofErr w:type="gramStart"/>
-      <w:r>
-        <w:t>is</w:t>
-      </w:r>
-      <w:proofErr w:type="gramEnd"/>
-      <w:r>
-        <w:t xml:space="preserve"> running</w:t>
+        <w:t xml:space="preserve">The test pass </w:t>
+      </w:r>
+      <w:r>
+        <w:t>successfully.</w:t>
       </w:r>
     </w:p>
     <w:p>

</xml_diff>